<commit_message>
Changed GDD and some enemy stats
</commit_message>
<xml_diff>
--- a/Slay the Labyrinth(ГДД).docx
+++ b/Slay the Labyrinth(ГДД).docx
@@ -4446,50 +4446,50 @@
                 <w:szCs w:val="24"/>
                 <w:rtl w:val="0"/>
               </w:rPr>
-              <w:t xml:space="preserve">Мешок с золотом</w:t>
-            </w:r>
-          </w:p>
-        </w:tc>
-        <w:tc>
-          <w:tcPr>
-            <w:shd w:fill="auto" w:val="clear"/>
-            <w:tcMar>
-              <w:top w:w="100.0" w:type="dxa"/>
-              <w:left w:w="100.0" w:type="dxa"/>
-              <w:bottom w:w="100.0" w:type="dxa"/>
-              <w:right w:w="100.0" w:type="dxa"/>
-            </w:tcMar>
-            <w:vAlign w:val="top"/>
-          </w:tcPr>
-          <w:p>
-            <w:pPr>
-              <w:keepNext w:val="0"/>
-              <w:keepLines w:val="0"/>
-              <w:pageBreakBefore w:val="0"/>
-              <w:widowControl w:val="0"/>
-              <w:pBdr>
-                <w:top w:space="0" w:sz="0" w:val="nil"/>
-                <w:left w:space="0" w:sz="0" w:val="nil"/>
-                <w:bottom w:space="0" w:sz="0" w:val="nil"/>
-                <w:right w:space="0" w:sz="0" w:val="nil"/>
-                <w:between w:space="0" w:sz="0" w:val="nil"/>
-              </w:pBdr>
-              <w:shd w:fill="auto" w:val="clear"/>
-              <w:spacing w:after="0" w:before="0" w:line="240" w:lineRule="auto"/>
-              <w:ind w:left="0" w:right="0" w:firstLine="0"/>
-              <w:jc w:val="left"/>
-              <w:rPr>
-                <w:sz w:val="24"/>
-                <w:szCs w:val="24"/>
-              </w:rPr>
-            </w:pPr>
-            <w:r>
-              <w:rPr>
-                <w:sz w:val="24"/>
-                <w:szCs w:val="24"/>
-                <w:rtl w:val="0"/>
-              </w:rPr>
-              <w:t xml:space="preserve">+300 монет</w:t>
+              <w:t xml:space="preserve">Талисман берсерка</w:t>
+            </w:r>
+          </w:p>
+        </w:tc>
+        <w:tc>
+          <w:tcPr>
+            <w:shd w:fill="auto" w:val="clear"/>
+            <w:tcMar>
+              <w:top w:w="100.0" w:type="dxa"/>
+              <w:left w:w="100.0" w:type="dxa"/>
+              <w:bottom w:w="100.0" w:type="dxa"/>
+              <w:right w:w="100.0" w:type="dxa"/>
+            </w:tcMar>
+            <w:vAlign w:val="top"/>
+          </w:tcPr>
+          <w:p>
+            <w:pPr>
+              <w:keepNext w:val="0"/>
+              <w:keepLines w:val="0"/>
+              <w:pageBreakBefore w:val="0"/>
+              <w:widowControl w:val="0"/>
+              <w:pBdr>
+                <w:top w:space="0" w:sz="0" w:val="nil"/>
+                <w:left w:space="0" w:sz="0" w:val="nil"/>
+                <w:bottom w:space="0" w:sz="0" w:val="nil"/>
+                <w:right w:space="0" w:sz="0" w:val="nil"/>
+                <w:between w:space="0" w:sz="0" w:val="nil"/>
+              </w:pBdr>
+              <w:shd w:fill="auto" w:val="clear"/>
+              <w:spacing w:after="0" w:before="0" w:line="240" w:lineRule="auto"/>
+              <w:ind w:left="0" w:right="0" w:firstLine="0"/>
+              <w:jc w:val="left"/>
+              <w:rPr>
+                <w:sz w:val="24"/>
+                <w:szCs w:val="24"/>
+              </w:rPr>
+            </w:pPr>
+            <w:r>
+              <w:rPr>
+                <w:sz w:val="24"/>
+                <w:szCs w:val="24"/>
+                <w:rtl w:val="0"/>
+              </w:rPr>
+              <w:t xml:space="preserve">+3 атаки +3 скорости</w:t>
             </w:r>
           </w:p>
         </w:tc>
@@ -5108,39 +5108,84 @@
     <w:p>
       <w:pPr>
         <w:spacing w:line="360" w:lineRule="auto"/>
-        <w:rPr>
-          <w:sz w:val="24"/>
-          <w:szCs w:val="24"/>
-        </w:rPr>
-      </w:pPr>
-      <w:r>
-        <w:rPr>
-          <w:rtl w:val="0"/>
-        </w:rPr>
-      </w:r>
-    </w:p>
-    <w:p>
-      <w:pPr>
-        <w:spacing w:line="360" w:lineRule="auto"/>
-        <w:rPr>
-          <w:sz w:val="24"/>
-          <w:szCs w:val="24"/>
-        </w:rPr>
-      </w:pPr>
-      <w:r>
-        <w:rPr>
-          <w:sz w:val="24"/>
-          <w:szCs w:val="24"/>
-          <w:rtl w:val="0"/>
-        </w:rPr>
-        <w:t xml:space="preserve">Призрак</w:t>
+        <w:ind w:left="0" w:firstLine="0"/>
+        <w:rPr>
+          <w:sz w:val="24"/>
+          <w:szCs w:val="24"/>
+        </w:rPr>
+      </w:pPr>
+      <w:r>
+        <w:rPr>
+          <w:rtl w:val="0"/>
+        </w:rPr>
+      </w:r>
+    </w:p>
+    <w:p>
+      <w:pPr>
+        <w:spacing w:line="360" w:lineRule="auto"/>
+        <w:ind w:left="0" w:firstLine="0"/>
+        <w:rPr>
+          <w:sz w:val="24"/>
+          <w:szCs w:val="24"/>
+        </w:rPr>
+      </w:pPr>
+      <w:r>
+        <w:rPr>
+          <w:sz w:val="24"/>
+          <w:szCs w:val="24"/>
+          <w:rtl w:val="0"/>
+        </w:rPr>
+        <w:t xml:space="preserve">Гоблин(30 здоровья, 20 атаки, 40 скорости)</w:t>
         <w:br w:type="textWrapping"/>
-        <w:t xml:space="preserve">Кобальт</w:t>
-        <w:br w:type="textWrapping"/>
-        <w:t xml:space="preserve">Группа гоблинов</w:t>
-        <w:br w:type="textWrapping"/>
-        <w:t xml:space="preserve">Голем</w:t>
-        <w:br w:type="textWrapping"/>
+        <w:t xml:space="preserve">Скелет(50 здоровья, 15 атаки, 30 скорости)</w:t>
+      </w:r>
+    </w:p>
+    <w:p>
+      <w:pPr>
+        <w:spacing w:line="360" w:lineRule="auto"/>
+        <w:ind w:left="0" w:firstLine="0"/>
+        <w:rPr>
+          <w:sz w:val="24"/>
+          <w:szCs w:val="24"/>
+        </w:rPr>
+      </w:pPr>
+      <w:r>
+        <w:rPr>
+          <w:sz w:val="24"/>
+          <w:szCs w:val="24"/>
+          <w:rtl w:val="0"/>
+        </w:rPr>
+        <w:t xml:space="preserve">Слизень(60 здоровья, 16 атаки, 20 скорости)</w:t>
+      </w:r>
+    </w:p>
+    <w:p>
+      <w:pPr>
+        <w:spacing w:line="360" w:lineRule="auto"/>
+        <w:ind w:left="0" w:firstLine="0"/>
+        <w:rPr>
+          <w:sz w:val="24"/>
+          <w:szCs w:val="24"/>
+        </w:rPr>
+      </w:pPr>
+      <w:r>
+        <w:rPr>
+          <w:rtl w:val="0"/>
+        </w:rPr>
+      </w:r>
+    </w:p>
+    <w:p>
+      <w:pPr>
+        <w:spacing w:line="360" w:lineRule="auto"/>
+        <w:ind w:left="0" w:firstLine="0"/>
+        <w:rPr>
+          <w:sz w:val="24"/>
+          <w:szCs w:val="24"/>
+        </w:rPr>
+      </w:pPr>
+      <w:r>
+        <w:rPr>
+          <w:rtl w:val="0"/>
+        </w:rPr>
       </w:r>
     </w:p>
     <w:p>
@@ -5198,26 +5243,9 @@
         <w:t xml:space="preserve">— Скорость</w:t>
         <w:br w:type="textWrapping"/>
         <w:br w:type="textWrapping"/>
-        <w:t xml:space="preserve">Вампир</w:t>
+        <w:t xml:space="preserve">Огр(70 здоровья, 30 атаки, 30 скорости)</w:t>
         <w:br w:type="textWrapping"/>
-        <w:t xml:space="preserve">Демон </w:t>
-      </w:r>
-    </w:p>
-    <w:p>
-      <w:pPr>
-        <w:spacing w:line="360" w:lineRule="auto"/>
-        <w:rPr>
-          <w:sz w:val="24"/>
-          <w:szCs w:val="24"/>
-        </w:rPr>
-      </w:pPr>
-      <w:r>
-        <w:rPr>
-          <w:sz w:val="24"/>
-          <w:szCs w:val="24"/>
-          <w:rtl w:val="0"/>
-        </w:rPr>
-        <w:t xml:space="preserve">Гигантский паук</w:t>
+        <w:t xml:space="preserve">Тролль(50 здоровья, 40 атаки, 50 скорости)</w:t>
         <w:br w:type="textWrapping"/>
       </w:r>
     </w:p>
@@ -5252,9 +5280,9 @@
           <w:szCs w:val="24"/>
           <w:rtl w:val="0"/>
         </w:rPr>
-        <w:t xml:space="preserve">Черный дракон</w:t>
+        <w:t xml:space="preserve">Черный дракон(90 здоровья, 20 атаки, 50 скорости)</w:t>
         <w:br w:type="textWrapping"/>
-        <w:t xml:space="preserve">Огненный великан</w:t>
+        <w:t xml:space="preserve">Суккуб(70 здоровья, 30 атаки, 60 скорости)</w:t>
       </w:r>
     </w:p>
     <w:p>

</xml_diff>